<commit_message>
added the marketing toolkit - the "at a glance" toolkit (and a template) - removed the scriptronaut strategic doc (was redondant and all is in other existing doc) - website mockup
</commit_message>
<xml_diff>
--- a/documents/strategic_direction_and_roadmaps/10_business/10_product_vision_qc.docx
+++ b/documents/strategic_direction_and_roadmaps/10_business/10_product_vision_qc.docx
@@ -46,7 +46,7 @@
           <w:sz w:val="20"/>
           <w:szCs w:val="20"/>
         </w:rPr>
-        <w:t>Last updated: [2026-08-16]  ·  Owners: [Stephane Barbin, Scot Thompson]  ·  Status: Directional, not committed to dates</w:t>
+        <w:t>Last updated: 2026-08-16  ·  Owners: Stephane Barbin, Scot Thompson  ·  Status: Directional, not committed to dates</w:t>
       </w:r>
     </w:p>
     <w:p>
@@ -311,19 +311,7 @@
         <w:rPr>
           <w:rFonts w:ascii="Calibri" w:hAnsi="Calibri"/>
         </w:rPr>
-        <w:t xml:space="preserve">  —  </w:t>
-      </w:r>
-      <w:r>
-        <w:rPr>
-          <w:rFonts w:ascii="Calibri" w:hAnsi="Calibri"/>
-        </w:rPr>
-        <w:t>S</w:t>
-      </w:r>
-      <w:r>
-        <w:rPr>
-          <w:rFonts w:ascii="Calibri" w:hAnsi="Calibri"/>
-        </w:rPr>
-        <w:t>tarted</w:t>
+        <w:t xml:space="preserve">  —  Started</w:t>
       </w:r>
     </w:p>
     <w:p>
@@ -1021,8 +1009,8 @@
         </w:tblCellMar>
       </w:tblPr>
       <w:tblGrid>
-        <w:gridCol w:w="1617"/>
-        <w:gridCol w:w="2388"/>
+        <w:gridCol w:w="1616"/>
+        <w:gridCol w:w="2389"/>
         <w:gridCol w:w="2490"/>
         <w:gridCol w:w="3510"/>
       </w:tblGrid>
@@ -1032,7 +1020,7 @@
         </w:trPr>
         <w:tc>
           <w:tcPr>
-            <w:tcW w:w="1617" w:type="dxa"/>
+            <w:tcW w:w="1616" w:type="dxa"/>
             <w:tcBorders/>
             <w:vAlign w:val="center"/>
           </w:tcPr>
@@ -1055,7 +1043,7 @@
         </w:tc>
         <w:tc>
           <w:tcPr>
-            <w:tcW w:w="2388" w:type="dxa"/>
+            <w:tcW w:w="2389" w:type="dxa"/>
             <w:tcBorders/>
             <w:vAlign w:val="center"/>
           </w:tcPr>
@@ -1117,7 +1105,7 @@
         </w:trPr>
         <w:tc>
           <w:tcPr>
-            <w:tcW w:w="1617" w:type="dxa"/>
+            <w:tcW w:w="1616" w:type="dxa"/>
             <w:tcBorders/>
             <w:vAlign w:val="center"/>
           </w:tcPr>
@@ -1141,7 +1129,7 @@
         </w:tc>
         <w:tc>
           <w:tcPr>
-            <w:tcW w:w="2388" w:type="dxa"/>
+            <w:tcW w:w="2389" w:type="dxa"/>
             <w:tcBorders/>
             <w:vAlign w:val="center"/>
           </w:tcPr>
@@ -1218,7 +1206,7 @@
         </w:trPr>
         <w:tc>
           <w:tcPr>
-            <w:tcW w:w="1617" w:type="dxa"/>
+            <w:tcW w:w="1616" w:type="dxa"/>
             <w:tcBorders/>
             <w:vAlign w:val="center"/>
           </w:tcPr>
@@ -1242,7 +1230,7 @@
         </w:tc>
         <w:tc>
           <w:tcPr>
-            <w:tcW w:w="2388" w:type="dxa"/>
+            <w:tcW w:w="2389" w:type="dxa"/>
             <w:tcBorders/>
             <w:vAlign w:val="center"/>
           </w:tcPr>
@@ -1319,7 +1307,7 @@
         </w:trPr>
         <w:tc>
           <w:tcPr>
-            <w:tcW w:w="1617" w:type="dxa"/>
+            <w:tcW w:w="1616" w:type="dxa"/>
             <w:tcBorders/>
             <w:vAlign w:val="center"/>
           </w:tcPr>
@@ -1343,7 +1331,7 @@
         </w:tc>
         <w:tc>
           <w:tcPr>
-            <w:tcW w:w="2388" w:type="dxa"/>
+            <w:tcW w:w="2389" w:type="dxa"/>
             <w:tcBorders/>
             <w:vAlign w:val="center"/>
           </w:tcPr>
@@ -1420,7 +1408,7 @@
         </w:trPr>
         <w:tc>
           <w:tcPr>
-            <w:tcW w:w="1617" w:type="dxa"/>
+            <w:tcW w:w="1616" w:type="dxa"/>
             <w:tcBorders/>
             <w:vAlign w:val="center"/>
           </w:tcPr>
@@ -1444,7 +1432,7 @@
         </w:tc>
         <w:tc>
           <w:tcPr>
-            <w:tcW w:w="2388" w:type="dxa"/>
+            <w:tcW w:w="2389" w:type="dxa"/>
             <w:tcBorders/>
             <w:vAlign w:val="center"/>
           </w:tcPr>
@@ -1519,7 +1507,7 @@
         <w:trPr/>
         <w:tc>
           <w:tcPr>
-            <w:tcW w:w="1617" w:type="dxa"/>
+            <w:tcW w:w="1616" w:type="dxa"/>
             <w:tcBorders/>
             <w:vAlign w:val="center"/>
           </w:tcPr>
@@ -1543,7 +1531,7 @@
         </w:tc>
         <w:tc>
           <w:tcPr>
-            <w:tcW w:w="2388" w:type="dxa"/>
+            <w:tcW w:w="2389" w:type="dxa"/>
             <w:tcBorders/>
             <w:vAlign w:val="center"/>
           </w:tcPr>
@@ -2172,8 +2160,8 @@
       <w:u w:val="single"/>
     </w:rPr>
   </w:style>
-  <w:style w:type="character" w:styleId="FootnoteCharactersuser">
-    <w:name w:val="Footnote Characters (user)"/>
+  <w:style w:type="character" w:styleId="FootnoteCharacters">
+    <w:name w:val="Footnote Characters"/>
     <w:uiPriority w:val="99"/>
     <w:semiHidden/>
     <w:unhideWhenUsed/>
@@ -2182,8 +2170,8 @@
       <w:vertAlign w:val="superscript"/>
     </w:rPr>
   </w:style>
-  <w:style w:type="character" w:styleId="FootnoteCharacters">
-    <w:name w:val="Footnote Characters"/>
+  <w:style w:type="character" w:styleId="FootnoteCharactersuser">
+    <w:name w:val="Footnote Characters (user)"/>
     <w:qFormat/>
     <w:rPr>
       <w:vertAlign w:val="superscript"/>
@@ -2207,8 +2195,8 @@
       <w:szCs w:val="20"/>
     </w:rPr>
   </w:style>
-  <w:style w:type="character" w:styleId="EndnoteCharactersuser">
-    <w:name w:val="Endnote Characters (user)"/>
+  <w:style w:type="character" w:styleId="EndnoteCharacters">
+    <w:name w:val="Endnote Characters"/>
     <w:uiPriority w:val="99"/>
     <w:semiHidden/>
     <w:unhideWhenUsed/>
@@ -2217,8 +2205,8 @@
       <w:vertAlign w:val="superscript"/>
     </w:rPr>
   </w:style>
-  <w:style w:type="character" w:styleId="EndnoteCharacters">
-    <w:name w:val="Endnote Characters"/>
+  <w:style w:type="character" w:styleId="EndnoteCharactersuser">
+    <w:name w:val="Endnote Characters (user)"/>
     <w:qFormat/>
     <w:rPr>
       <w:vertAlign w:val="superscript"/>

</xml_diff>